<commit_message>
Interview guide: keep only the 8 core questions
Co-Authored-By: Claude Opus 5.5 <noreply@anthropic.com>
Claude-Session: https://claude.ai/code/session_01636X1CrJaE3Lam1oWVZE4A
</commit_message>
<xml_diff>
--- a/שאלות לראיון - מוגבלות בלתי נראית.docx
+++ b/שאלות לראיון - מוגבלות בלתי נראית.docx
@@ -229,7 +229,7 @@
           <w:szCs w:val="24"/>
           <w:rtl/>
         </w:rPr>
-        <w:t xml:space="preserve">לא לשפוט, לא להביע דעה ולא לתת עצות. להקשיב, ולתת לשתיקות להימשך. כשהתשובה כללית, לבקש דוגמה: "תוכל/י לספר על פעם אחת שזה קרה?". אפשר להוסיף שאלות המשך לפי מה שעולה, אבל שמונה השאלות המרכזיות נשאלות בנוסח הזה, כי אותו נוסח ישמש בראיון עם ה-AI.</w:t>
+        <w:t xml:space="preserve">לא לשפוט, לא להביע דעה ולא לתת עצות. להקשיב, ולתת לשתיקות להימשך. כשהתשובה כללית, לבקש דוגמה: "תוכל/י לספר על פעם אחת שזה קרה?". שמונה השאלות נשאלות בנוסח הזה, כי אותו נוסח ישמש גם בראיון עם ה-AI.</w:t>
       </w:r>
     </w:p>
     <w:p>
@@ -255,22 +255,6 @@
     </w:p>
     <w:p>
       <w:pPr>
-        <w:bidi/>
-        <w:spacing w:after="60" w:before="0" w:line="360"/>
-        <w:jc w:val="both"/>
-      </w:pPr>
-      <w:r>
-        <w:rPr>
-          <w:rFonts w:ascii="David" w:cs="David" w:eastAsia="David" w:hAnsi="David"/>
-          <w:sz w:val="24"/>
-          <w:szCs w:val="24"/>
-          <w:rtl/>
-        </w:rPr>
-        <w:t xml:space="preserve">שאלות ההמשך מתחת לכל שאלה הן אפשרויות בלבד. משתמשים בהן רק אם צריך.</w:t>
-      </w:r>
-    </w:p>
-    <w:p>
-      <w:pPr>
         <w:keepNext/>
         <w:bidi/>
         <w:spacing w:after="40" w:before="120" w:line="360"/>
@@ -300,23 +284,6 @@
     <w:p>
       <w:pPr>
         <w:bidi/>
-        <w:spacing w:after="20" w:before="0" w:line="360"/>
-        <w:ind w:start="567"/>
-        <w:jc w:val="both"/>
-      </w:pPr>
-      <w:r>
-        <w:rPr>
-          <w:rFonts w:ascii="David" w:cs="David" w:eastAsia="David" w:hAnsi="David"/>
-          <w:sz w:val="24"/>
-          <w:szCs w:val="24"/>
-          <w:rtl/>
-        </w:rPr>
-        <w:t xml:space="preserve">המשך: מתי זה התחיל? איך הגעת לאבחון? איך נראה יום טוב ואיך נראה יום קשה?</w:t>
-      </w:r>
-    </w:p>
-    <w:p>
-      <w:pPr>
-        <w:bidi/>
         <w:spacing w:after="120" w:before="0" w:line="360"/>
         <w:jc w:val="both"/>
       </w:pPr>
@@ -361,23 +328,6 @@
     <w:p>
       <w:pPr>
         <w:bidi/>
-        <w:spacing w:after="20" w:before="0" w:line="360"/>
-        <w:ind w:start="567"/>
-        <w:jc w:val="both"/>
-      </w:pPr>
-      <w:r>
-        <w:rPr>
-          <w:rFonts w:ascii="David" w:cs="David" w:eastAsia="David" w:hAnsi="David"/>
-          <w:sz w:val="24"/>
-          <w:szCs w:val="24"/>
-          <w:rtl/>
-        </w:rPr>
-        <w:t xml:space="preserve">המשך: באיזה תחום זה מורגש הכי הרבה? תוכל/י לתת דוגמה מהשבוע האחרון?</w:t>
-      </w:r>
-    </w:p>
-    <w:p>
-      <w:pPr>
-        <w:bidi/>
         <w:spacing w:after="120" w:before="0" w:line="360"/>
         <w:jc w:val="both"/>
       </w:pPr>
@@ -422,23 +372,6 @@
     <w:p>
       <w:pPr>
         <w:bidi/>
-        <w:spacing w:after="20" w:before="0" w:line="360"/>
-        <w:ind w:start="567"/>
-        <w:jc w:val="both"/>
-      </w:pPr>
-      <w:r>
-        <w:rPr>
-          <w:rFonts w:ascii="David" w:cs="David" w:eastAsia="David" w:hAnsi="David"/>
-          <w:sz w:val="24"/>
-          <w:szCs w:val="24"/>
-          <w:rtl/>
-        </w:rPr>
-        <w:t xml:space="preserve">המשך: כשמשהו לא מצליח, למה את/ה מייחס/ת את זה? מה עוזר לך להתמודד ומה מקשה עליך?</w:t>
-      </w:r>
-    </w:p>
-    <w:p>
-      <w:pPr>
-        <w:bidi/>
         <w:spacing w:after="120" w:before="0" w:line="360"/>
         <w:jc w:val="both"/>
       </w:pPr>
@@ -483,23 +416,6 @@
     <w:p>
       <w:pPr>
         <w:bidi/>
-        <w:spacing w:after="20" w:before="0" w:line="360"/>
-        <w:ind w:start="567"/>
-        <w:jc w:val="both"/>
-      </w:pPr>
-      <w:r>
-        <w:rPr>
-          <w:rFonts w:ascii="David" w:cs="David" w:eastAsia="David" w:hAnsi="David"/>
-          <w:sz w:val="24"/>
-          <w:szCs w:val="24"/>
-          <w:rtl/>
-        </w:rPr>
-        <w:t xml:space="preserve">המשך: האם חווית חוסר הבנה, דעות קדומות או אפליה? איזו תמיכה את/ה מקבל/ת, ומה היית רוצה שישתנה?</w:t>
-      </w:r>
-    </w:p>
-    <w:p>
-      <w:pPr>
-        <w:bidi/>
         <w:spacing w:after="120" w:before="0" w:line="360"/>
         <w:jc w:val="both"/>
       </w:pPr>
@@ -544,23 +460,6 @@
     <w:p>
       <w:pPr>
         <w:bidi/>
-        <w:spacing w:after="20" w:before="0" w:line="360"/>
-        <w:ind w:start="567"/>
-        <w:jc w:val="both"/>
-      </w:pPr>
-      <w:r>
-        <w:rPr>
-          <w:rFonts w:ascii="David" w:cs="David" w:eastAsia="David" w:hAnsi="David"/>
-          <w:sz w:val="24"/>
-          <w:szCs w:val="24"/>
-          <w:rtl/>
-        </w:rPr>
-        <w:t xml:space="preserve">המשך: ספר/י על פעם שסיפרת. איך הגיבו? זה שונה בעבודה, בלימודים, בזוגיות?</w:t>
-      </w:r>
-    </w:p>
-    <w:p>
-      <w:pPr>
-        <w:bidi/>
         <w:spacing w:after="120" w:before="0" w:line="360"/>
         <w:jc w:val="both"/>
       </w:pPr>
@@ -605,23 +504,6 @@
     <w:p>
       <w:pPr>
         <w:bidi/>
-        <w:spacing w:after="20" w:before="0" w:line="360"/>
-        <w:ind w:start="567"/>
-        <w:jc w:val="both"/>
-      </w:pPr>
-      <w:r>
-        <w:rPr>
-          <w:rFonts w:ascii="David" w:cs="David" w:eastAsia="David" w:hAnsi="David"/>
-          <w:sz w:val="24"/>
-          <w:szCs w:val="24"/>
-          <w:rtl/>
-        </w:rPr>
-        <w:t xml:space="preserve">המשך: מה ההסתרה דרשה ממך? מה היה קורה, לדעתך, אם היו יודעים?</w:t>
-      </w:r>
-    </w:p>
-    <w:p>
-      <w:pPr>
-        <w:bidi/>
         <w:spacing w:after="120" w:before="0" w:line="360"/>
         <w:jc w:val="both"/>
       </w:pPr>
@@ -666,23 +548,6 @@
     <w:p>
       <w:pPr>
         <w:bidi/>
-        <w:spacing w:after="20" w:before="0" w:line="360"/>
-        <w:ind w:start="567"/>
-        <w:jc w:val="both"/>
-      </w:pPr>
-      <w:r>
-        <w:rPr>
-          <w:rFonts w:ascii="David" w:cs="David" w:eastAsia="David" w:hAnsi="David"/>
-          <w:sz w:val="24"/>
-          <w:szCs w:val="24"/>
-          <w:rtl/>
-        </w:rPr>
-        <w:t xml:space="preserve">המשך: היו מצבים שלא האמינו לך? מצבים שבהם דווקא נוח שלא רואים?</w:t>
-      </w:r>
-    </w:p>
-    <w:p>
-      <w:pPr>
-        <w:bidi/>
         <w:spacing w:after="120" w:before="0" w:line="360"/>
         <w:jc w:val="both"/>
       </w:pPr>
@@ -727,23 +592,6 @@
     <w:p>
       <w:pPr>
         <w:bidi/>
-        <w:spacing w:after="20" w:before="0" w:line="360"/>
-        <w:ind w:start="567"/>
-        <w:jc w:val="both"/>
-      </w:pPr>
-      <w:r>
-        <w:rPr>
-          <w:rFonts w:ascii="David" w:cs="David" w:eastAsia="David" w:hAnsi="David"/>
-          <w:sz w:val="24"/>
-          <w:szCs w:val="24"/>
-          <w:rtl/>
-        </w:rPr>
-        <w:t xml:space="preserve">המשך: האם יש דברים חיוביים, יכולות או תובנות שפיתחת בעקבות ההתמודדות?</w:t>
-      </w:r>
-    </w:p>
-    <w:p>
-      <w:pPr>
-        <w:bidi/>
         <w:spacing w:after="120" w:before="0" w:line="360"/>
         <w:jc w:val="both"/>
       </w:pPr>
@@ -773,7 +621,7 @@
           <w:szCs w:val="24"/>
           <w:rtl/>
         </w:rPr>
-        <w:t xml:space="preserve">סיום.</w:t>
+        <w:t xml:space="preserve">לסיום (לפי ההנחיות, לא נספרת בשמונה).</w:t>
       </w:r>
       <w:r>
         <w:rPr>

</xml_diff>

<commit_message>
Interview guide: state the 7-8 question rule and required closing question
Co-Authored-By: Claude Opus 5.5 <noreply@anthropic.com>
Claude-Session: https://claude.ai/code/session_01636X1CrJaE3Lam1oWVZE4A
</commit_message>
<xml_diff>
--- a/שאלות לראיון - מוגבלות בלתי נראית.docx
+++ b/שאלות לראיון - מוגבלות בלתי נראית.docx
@@ -229,7 +229,7 @@
           <w:szCs w:val="24"/>
           <w:rtl/>
         </w:rPr>
-        <w:t xml:space="preserve">לא לשפוט, לא להביע דעה ולא לתת עצות. להקשיב, ולתת לשתיקות להימשך. כשהתשובה כללית, לבקש דוגמה: "תוכל/י לספר על פעם אחת שזה קרה?". שמונה השאלות נשאלות בנוסח הזה, כי אותו נוסח ישמש גם בראיון עם ה-AI.</w:t>
+        <w:t xml:space="preserve">לא לשפוט, לא להביע דעה ולא לתת עצות. להקשיב, ולתת לשתיקות להימשך. כשהתשובה כללית, לבקש דוגמה: "תוכל/י לספר על פעם אחת שזה קרה?". שמונה השאלות המרכזיות נשאלות בנוסח הזה, כי אותו נוסח ישמש גם בראיון עם ה-AI. שאלות המשך מותרות לפי מה שעולה בשיחה.</w:t>
       </w:r>
     </w:p>
     <w:p>
@@ -255,6 +255,22 @@
     </w:p>
     <w:p>
       <w:pPr>
+        <w:bidi/>
+        <w:spacing w:after="60" w:before="0" w:line="360"/>
+        <w:jc w:val="both"/>
+      </w:pPr>
+      <w:r>
+        <w:rPr>
+          <w:rFonts w:ascii="David" w:cs="David" w:eastAsia="David" w:hAnsi="David"/>
+          <w:sz w:val="24"/>
+          <w:szCs w:val="24"/>
+          <w:rtl/>
+        </w:rPr>
+        <w:t xml:space="preserve">לפי ההנחיות: נבחרו 8 שאלות מתוך הרשימה (נדרשות 7-8), ובסוף נשאלת שאלת סיום. מותר להוסיף שאלות המשך לפי התשובות ולבקש דוגמאות אישיות.</w:t>
+      </w:r>
+    </w:p>
+    <w:p>
+      <w:pPr>
         <w:keepNext/>
         <w:bidi/>
         <w:spacing w:after="40" w:before="120" w:line="360"/>
@@ -621,7 +637,7 @@
           <w:szCs w:val="24"/>
           <w:rtl/>
         </w:rPr>
-        <w:t xml:space="preserve">לסיום (לפי ההנחיות, לא נספרת בשמונה).</w:t>
+        <w:t xml:space="preserve">שאלת סיום (חובה לפי ההנחיות, בנוסף ל-8 השאלות).</w:t>
       </w:r>
       <w:r>
         <w:rPr>

</xml_diff>